<commit_message>
docs: corrige integrantes do grupo
</commit_message>
<xml_diff>
--- a/outputs/Entrega_1_Azure_Function_CloudLog.docx
+++ b/outputs/Entrega_1_Azure_Function_CloudLog.docx
@@ -154,7 +154,7 @@
                 <w:color w:val="172B3A"/>
                 <w:sz w:val="19"/>
               </w:rPr>
-              <w:t>Camilla Uber • João Davi • Laura Guillarducci • Manoel Valerio da Silveira Neto</w:t>
+              <w:t>Camilla Uber • João Davi • Laura Guillarducci</w:t>
             </w:r>
           </w:p>
         </w:tc>
@@ -1317,90 +1317,6 @@
       </w:tr>
     </w:tbl>
     <w:p>
-      <w:pPr>
-        <w:pStyle w:val="Heading2"/>
-      </w:pPr>
-      <w:r>
-        <w:t>Manoel</w:t>
-      </w:r>
-    </w:p>
-    <w:tbl>
-      <w:tblPr>
-        <w:tblW w:type="dxa" w:w="9360"/>
-        <w:jc w:val="left"/>
-        <w:tblLayout w:type="fixed"/>
-        <w:tblLook w:firstColumn="1" w:firstRow="1" w:lastColumn="0" w:lastRow="0" w:noHBand="0" w:noVBand="1" w:val="04A0"/>
-        <w:tblInd w:w="120" w:type="dxa"/>
-      </w:tblPr>
-      <w:tblGrid>
-        <w:gridCol w:w="9360"/>
-      </w:tblGrid>
-      <w:tr>
-        <w:tc>
-          <w:tcPr>
-            <w:tcW w:type="dxa" w:w="9360"/>
-            <w:shd w:fill="F8FAFB"/>
-            <w:vAlign w:val="top"/>
-            <w:tcMar>
-              <w:top w:w="120" w:type="dxa"/>
-              <w:start w:w="140" w:type="dxa"/>
-              <w:bottom w:w="120" w:type="dxa"/>
-              <w:end w:w="140" w:type="dxa"/>
-            </w:tcMar>
-          </w:tcPr>
-          <w:p>
-            <w:pPr>
-              <w:spacing w:before="480" w:after="400"/>
-              <w:jc w:val="center"/>
-            </w:pPr>
-            <w:r>
-              <w:rPr>
-                <w:rFonts w:ascii="Calibri" w:hAnsi="Calibri"/>
-                <w:b/>
-                <w:i w:val="0"/>
-                <w:color w:val="00A99D"/>
-                <w:sz w:val="20"/>
-              </w:rPr>
-              <w:t>INSERIR CAPTURA DE TELA AQUI</w:t>
-              <w:br/>
-            </w:r>
-            <w:r>
-              <w:rPr>
-                <w:rFonts w:ascii="Calibri" w:hAnsi="Calibri"/>
-                <w:b w:val="0"/>
-                <w:i/>
-                <w:color w:val="5C7182"/>
-                <w:sz w:val="17"/>
-              </w:rPr>
-              <w:t>Conta Azure for Students ativa + conclusão do módulo Microsoft Learn.</w:t>
-            </w:r>
-            <w:r>
-              <w:rPr>
-                <w:rFonts w:ascii="Calibri" w:hAnsi="Calibri"/>
-                <w:b w:val="0"/>
-                <w:i w:val="0"/>
-                <w:color w:val="F8FAFB"/>
-                <w:sz w:val="14"/>
-              </w:rPr>
-              <w:t xml:space="preserve"> </w:t>
-              <w:br/>
-            </w:r>
-            <w:r>
-              <w:rPr>
-                <w:rFonts w:ascii="Calibri" w:hAnsi="Calibri"/>
-                <w:b w:val="0"/>
-                <w:i w:val="0"/>
-                <w:color w:val="F8FAFB"/>
-                <w:sz w:val="14"/>
-              </w:rPr>
-              <w:t xml:space="preserve"> </w:t>
-              <w:br/>
-            </w:r>
-          </w:p>
-        </w:tc>
-      </w:tr>
-    </w:tbl>
-    <w:p>
       <w:r>
         <w:br w:type="page"/>
       </w:r>

</xml_diff>